<commit_message>
Remove UiPath & Spark AI, mark Power BI complete, align resume to TrioTree/GitHub Copilot, fix timeline bullet alignment
</commit_message>
<xml_diff>
--- a/Mohammed_Imthiyaz_A_Resume.docx
+++ b/Mohammed_Imthiyaz_A_Resume.docx
@@ -1,5 +1,52 @@
 
-<file path=word/document.xml><?xml version="1.0" encoding="utf-8"?>
+<file path=docProps\app.xml><?xml version="1.0" encoding="utf-8"?>
+<Properties xmlns="http://schemas.openxmlformats.org/officeDocument/2006/extended-properties" xmlns:vt="http://schemas.openxmlformats.org/officeDocument/2006/docPropsVTypes">
+  <Template>Normal</Template>
+  <TotalTime>1</TotalTime>
+  <Pages>2</Pages>
+  <Words>1425</Words>
+  <Characters>8125</Characters>
+  <Application>Microsoft Office Word</Application>
+  <DocSecurity>0</DocSecurity>
+  <Lines>67</Lines>
+  <Paragraphs>19</Paragraphs>
+  <ScaleCrop>false</ScaleCrop>
+  <HeadingPairs>
+    <vt:vector size="2" baseType="variant">
+      <vt:variant>
+        <vt:lpstr>Title</vt:lpstr>
+      </vt:variant>
+      <vt:variant>
+        <vt:i4>1</vt:i4>
+      </vt:variant>
+    </vt:vector>
+  </HeadingPairs>
+  <TitlesOfParts>
+    <vt:vector size="1" baseType="lpstr">
+      <vt:lpstr>Mohammed Imthiyaz A - Resume</vt:lpstr>
+    </vt:vector>
+  </TitlesOfParts>
+  <Company/>
+  <LinksUpToDate>false</LinksUpToDate>
+  <CharactersWithSpaces>9531</CharactersWithSpaces>
+  <SharedDoc>false</SharedDoc>
+  <HyperlinksChanged>false</HyperlinksChanged>
+  <AppVersion>14.0000</AppVersion>
+</Properties>
+</file>
+
+<file path=docProps\core.xml><?xml version="1.0" encoding="utf-8"?>
+<cp:coreProperties xmlns:cp="http://schemas.openxmlformats.org/package/2006/metadata/core-properties" xmlns:dc="http://purl.org/dc/elements/1.1/" xmlns:dcterms="http://purl.org/dc/terms/" xmlns:dcmitype="http://purl.org/dc/dcmitype/" xmlns:xsi="http://www.w3.org/2001/XMLSchema-instance">
+  <dc:title>Mohammed Imthiyaz A - Resume</dc:title>
+  <dc:creator>Imtiyaz</dc:creator>
+  <cp:lastModifiedBy>Imtiyaz</cp:lastModifiedBy>
+  <cp:revision>2</cp:revision>
+  <dcterms:created xsi:type="dcterms:W3CDTF">2026-07-12T07:47:00Z</dcterms:created>
+  <dcterms:modified xsi:type="dcterms:W3CDTF">2026-07-12T07:47:00Z</dcterms:modified>
+</cp:coreProperties>
+</file>
+
+<file path=word\document.xml><?xml version="1.0" encoding="utf-8"?>
 <w:document xmlns:wpc="http://schemas.microsoft.com/office/word/2010/wordprocessingCanvas" xmlns:mc="http://schemas.openxmlformats.org/markup-compatibility/2006" xmlns:o="urn:schemas-microsoft-com:office:office" xmlns:r="http://schemas.openxmlformats.org/officeDocument/2006/relationships" xmlns:m="http://schemas.openxmlformats.org/officeDocument/2006/math" xmlns:v="urn:schemas-microsoft-com:vml" xmlns:wp14="http://schemas.microsoft.com/office/word/2010/wordprocessingDrawing" xmlns:wp="http://schemas.openxmlformats.org/drawingml/2006/wordprocessingDrawing" xmlns:w10="urn:schemas-microsoft-com:office:word" xmlns:w="http://schemas.openxmlformats.org/wordprocessingml/2006/main" xmlns:w14="http://schemas.microsoft.com/office/word/2010/wordml" xmlns:wpg="http://schemas.microsoft.com/office/word/2010/wordprocessingGroup" xmlns:wpi="http://schemas.microsoft.com/office/word/2010/wordprocessingInk" xmlns:wne="http://schemas.microsoft.com/office/word/2006/wordml" xmlns:wps="http://schemas.microsoft.com/office/word/2010/wordprocessingShape" mc:Ignorable="w14 wp14">
   <w:body>
     <w:p>
@@ -471,7 +518,7 @@
           <w:szCs w:val="20"/>
           <w:lang w:val="en"/>
         </w:rPr>
-        <w:t xml:space="preserve"> Python Automation | Browser Automation | Spark AI | Text-to-SQL AI | Augnito</w:t>
+        <w:t xml:space="preserve"> Python Automation | Browser Automation | Text-to-SQL AI | Augnito</w:t>
       </w:r>
       <w:r>
         <w:rPr>
@@ -585,7 +632,7 @@
           <w:szCs w:val="20"/>
           <w:lang w:val="en"/>
         </w:rPr>
-        <w:t xml:space="preserve"> HOSPITALS PRIVATE LIMITED, Hyderabad | Apr 2023 – Present (3+ Years)</w:t>
+        <w:t xml:space="preserve"> HOSPITALS PRIVATE LIMITED, Hyderabad | Apr 2023 â€“ Present (3+ Years)</w:t>
       </w:r>
     </w:p>
     <w:p>
@@ -613,7 +660,7 @@
           <w:szCs w:val="21"/>
           <w:lang w:val="en"/>
         </w:rPr>
-        <w:t>Lead quality analysis and business analysis for WHIS (Web-based Hospital Information System) serving 7+ Kamineni Hospital locations with multi-tenant architecture</w:t>
+        <w:t>Lead quality analysis and business analysis for TrioTree HMS (Web-based Hospital Information System) serving 7+ Kamineni Hospital locations with multi-tenant architecture</w:t>
       </w:r>
     </w:p>
     <w:p>
@@ -707,7 +754,7 @@
           <w:szCs w:val="21"/>
           <w:lang w:val="en"/>
         </w:rPr>
-        <w:t>Lead implementation of Spark AI - AI-based Radiology Reports Generation on Voice and Keywords for clinical efficiency and paperless operatio</w:t>
+        <w:t>Lead implementation of AI-based Radiology Reports Generation on Voice and Keywords for clinical efficiency and paperless operatio</w:t>
       </w:r>
       <w:r>
         <w:rPr>
@@ -854,7 +901,7 @@
           <w:szCs w:val="20"/>
           <w:lang w:val="en"/>
         </w:rPr>
-        <w:t>IDEAS2IT TECHNOLOGIES PRIVATE LIMITED, Chennai | Jul 2016 – Mar 2023 (6 Years 9 Mon</w:t>
+        <w:t>IDEAS2IT TECHNOLOGIES PRIVATE LIMITED, Chennai | Jul 2016 â€“ Mar 2023 (6 Years 9 Mon</w:t>
       </w:r>
       <w:r>
         <w:rPr>
@@ -1373,7 +1420,7 @@
           <w:rFonts w:ascii="Calibri" w:eastAsia="Times New Roman" w:hAnsi="Calibri" w:cs="Calibri"/>
           <w:lang w:val="en"/>
         </w:rPr>
-        <w:t>WHIS - Hospital Information System with AI Integration</w:t>
+        <w:t>TrioTree HMS - Hospital Information System with AI Integration</w:t>
       </w:r>
     </w:p>
     <w:p>
@@ -1537,7 +1584,7 @@
           <w:szCs w:val="21"/>
           <w:lang w:val="en"/>
         </w:rPr>
-        <w:t>Designed and deployed Spark AI - AI-based Radiology Reports Generation leveraging Voice and Ke</w:t>
+        <w:t>Designed and deployed AI-based Radiology Reports Generation leveraging Voice and Ke</w:t>
       </w:r>
       <w:r>
         <w:rPr>
@@ -1642,7 +1689,7 @@
           <w:szCs w:val="21"/>
           <w:lang w:val="en"/>
         </w:rPr>
-        <w:t>Self-developed Python automation using AI for browser automation to create master data into healthcare applications</w:t>
+        <w:t>Designed and built a Python browser-automation tool (with GitHub Copilot) that reads Excel data and auto-fills hospital master-data forms - eliminating days of manual data entry and the need for dedicated data-entry hires. Human-in-the-loop validation ensures data integrity</w:t>
       </w:r>
     </w:p>
     <w:p>
@@ -1877,7 +1924,7 @@
           <w:szCs w:val="20"/>
           <w:lang w:val="en"/>
         </w:rPr>
-        <w:t xml:space="preserve"> Python Automation | Browser Automation | Spark AI | Text-to-SQL | Augnito Voice-to-Text</w:t>
+        <w:t xml:space="preserve"> Python Automation | Browser Automation | Text-to-SQL | Augnito Voice-to-Text</w:t>
       </w:r>
     </w:p>
     <w:p>
@@ -2186,7 +2233,7 @@
           <w:szCs w:val="21"/>
           <w:lang w:val="en"/>
         </w:rPr>
-        <w:t xml:space="preserve"> Hands-on experience implementing Spark AI for radiology reports, voice-to-text conversion (Augnito), and intelligent healthcare automation</w:t>
+        <w:t xml:space="preserve"> Hands-on experience implementing AI radiology report generation, voice-to-text conversion (Augnito), and Python browser automation</w:t>
       </w:r>
     </w:p>
     <w:p>
@@ -2391,7 +2438,54 @@
 </w:document>
 </file>
 
-<file path=word/numbering.xml><?xml version="1.0" encoding="utf-8"?>
+<file path=word\fontTable.xml><?xml version="1.0" encoding="utf-8"?>
+<w:fonts xmlns:mc="http://schemas.openxmlformats.org/markup-compatibility/2006" xmlns:r="http://schemas.openxmlformats.org/officeDocument/2006/relationships" xmlns:w="http://schemas.openxmlformats.org/wordprocessingml/2006/main" xmlns:w14="http://schemas.microsoft.com/office/word/2010/wordml" mc:Ignorable="w14">
+  <w:font w:name="Symbol">
+    <w:panose1 w:val="05050102010706020507"/>
+    <w:charset w:val="02"/>
+    <w:family w:val="roman"/>
+    <w:pitch w:val="variable"/>
+    <w:sig w:usb0="00000000" w:usb1="10000000" w:usb2="00000000" w:usb3="00000000" w:csb0="80000000" w:csb1="00000000"/>
+  </w:font>
+  <w:font w:name="Times New Roman">
+    <w:panose1 w:val="02020603050405020304"/>
+    <w:charset w:val="00"/>
+    <w:family w:val="roman"/>
+    <w:pitch w:val="variable"/>
+    <w:sig w:usb0="E0002EFF" w:usb1="C000785B" w:usb2="00000009" w:usb3="00000000" w:csb0="000001FF" w:csb1="00000000"/>
+  </w:font>
+  <w:font w:name="Courier New">
+    <w:panose1 w:val="02070309020205020404"/>
+    <w:charset w:val="00"/>
+    <w:family w:val="modern"/>
+    <w:pitch w:val="fixed"/>
+    <w:sig w:usb0="E0002EFF" w:usb1="C0007843" w:usb2="00000009" w:usb3="00000000" w:csb0="000001FF" w:csb1="00000000"/>
+  </w:font>
+  <w:font w:name="Wingdings">
+    <w:panose1 w:val="05000000000000000000"/>
+    <w:charset w:val="02"/>
+    <w:family w:val="auto"/>
+    <w:pitch w:val="variable"/>
+    <w:sig w:usb0="00000000" w:usb1="10000000" w:usb2="00000000" w:usb3="00000000" w:csb0="80000000" w:csb1="00000000"/>
+  </w:font>
+  <w:font w:name="Cambria">
+    <w:panose1 w:val="02040503050406030204"/>
+    <w:charset w:val="00"/>
+    <w:family w:val="roman"/>
+    <w:pitch w:val="variable"/>
+    <w:sig w:usb0="E00006FF" w:usb1="420024FF" w:usb2="02000000" w:usb3="00000000" w:csb0="0000019F" w:csb1="00000000"/>
+  </w:font>
+  <w:font w:name="Calibri">
+    <w:panose1 w:val="020F0502020204030204"/>
+    <w:charset w:val="00"/>
+    <w:family w:val="swiss"/>
+    <w:pitch w:val="variable"/>
+    <w:sig w:usb0="E4002EFF" w:usb1="C200247B" w:usb2="00000009" w:usb3="00000000" w:csb0="000001FF" w:csb1="00000000"/>
+  </w:font>
+</w:fonts>
+</file>
+
+<file path=word\numbering.xml><?xml version="1.0" encoding="utf-8"?>
 <w:numbering xmlns:wpc="http://schemas.microsoft.com/office/word/2010/wordprocessingCanvas" xmlns:mc="http://schemas.openxmlformats.org/markup-compatibility/2006" xmlns:o="urn:schemas-microsoft-com:office:office" xmlns:r="http://schemas.openxmlformats.org/officeDocument/2006/relationships" xmlns:m="http://schemas.openxmlformats.org/officeDocument/2006/math" xmlns:v="urn:schemas-microsoft-com:vml" xmlns:wp14="http://schemas.microsoft.com/office/word/2010/wordprocessingDrawing" xmlns:wp="http://schemas.openxmlformats.org/drawingml/2006/wordprocessingDrawing" xmlns:w10="urn:schemas-microsoft-com:office:word" xmlns:w="http://schemas.openxmlformats.org/wordprocessingml/2006/main" xmlns:w14="http://schemas.microsoft.com/office/word/2010/wordml" xmlns:wpg="http://schemas.microsoft.com/office/word/2010/wordprocessingGroup" xmlns:wpi="http://schemas.microsoft.com/office/word/2010/wordprocessingInk" xmlns:wne="http://schemas.microsoft.com/office/word/2006/wordml" xmlns:wps="http://schemas.microsoft.com/office/word/2010/wordprocessingShape" mc:Ignorable="w14 wp14">
   <w:abstractNum w:abstractNumId="0">
     <w:nsid w:val="3C6E0DE4"/>
@@ -3308,7 +3402,53 @@
 </w:numbering>
 </file>
 
-<file path=word/styles.xml><?xml version="1.0" encoding="utf-8"?>
+<file path=word\settings.xml><?xml version="1.0" encoding="utf-8"?>
+<w:settings xmlns:mc="http://schemas.openxmlformats.org/markup-compatibility/2006" xmlns:o="urn:schemas-microsoft-com:office:office" xmlns:r="http://schemas.openxmlformats.org/officeDocument/2006/relationships" xmlns:m="http://schemas.openxmlformats.org/officeDocument/2006/math" xmlns:v="urn:schemas-microsoft-com:vml" xmlns:w10="urn:schemas-microsoft-com:office:word" xmlns:w="http://schemas.openxmlformats.org/wordprocessingml/2006/main" xmlns:w14="http://schemas.microsoft.com/office/word/2010/wordml" xmlns:sl="http://schemas.openxmlformats.org/schemaLibrary/2006/main" mc:Ignorable="w14">
+  <w:view w:val="web"/>
+  <w:zoom w:percent="100"/>
+  <w:defaultTabStop w:val="720"/>
+  <w:noPunctuationKerning/>
+  <w:characterSpacingControl w:val="doNotCompress"/>
+  <w:compat>
+    <w:doNotSnapToGridInCell/>
+    <w:doNotWrapTextWithPunct/>
+    <w:doNotUseEastAsianBreakRules/>
+    <w:growAutofit/>
+    <w:compatSetting w:name="compatibilityMode" w:uri="http://schemas.microsoft.com/office/word" w:val="14"/>
+  </w:compat>
+  <w:rsids>
+    <w:rsidRoot w:val="00BA1C56"/>
+    <w:rsid w:val="00052F35"/>
+    <w:rsid w:val="00BA1C56"/>
+  </w:rsids>
+  <m:mathPr>
+    <m:mathFont m:val="Cambria Math"/>
+    <m:brkBin m:val="before"/>
+    <m:brkBinSub m:val="--"/>
+    <m:smallFrac m:val="0"/>
+    <m:dispDef/>
+    <m:lMargin m:val="0"/>
+    <m:rMargin m:val="0"/>
+    <m:defJc m:val="centerGroup"/>
+    <m:wrapIndent m:val="1440"/>
+    <m:intLim m:val="subSup"/>
+    <m:naryLim m:val="undOvr"/>
+  </m:mathPr>
+  <w:themeFontLang w:val="en-IN"/>
+  <w:clrSchemeMapping w:bg1="light1" w:t1="dark1" w:bg2="light2" w:t2="dark2" w:accent1="accent1" w:accent2="accent2" w:accent3="accent3" w:accent4="accent4" w:accent5="accent5" w:accent6="accent6" w:hyperlink="hyperlink" w:followedHyperlink="followedHyperlink"/>
+  <w:doNotIncludeSubdocsInStats/>
+  <w:shapeDefaults>
+    <o:shapedefaults v:ext="edit" spidmax="1026"/>
+    <o:shapelayout v:ext="edit">
+      <o:idmap v:ext="edit" data="1"/>
+    </o:shapelayout>
+  </w:shapeDefaults>
+  <w:decimalSymbol w:val="."/>
+  <w:listSeparator w:val=","/>
+</w:settings>
+</file>
+
+<file path=word\styles.xml><?xml version="1.0" encoding="utf-8"?>
 <w:styles xmlns:mc="http://schemas.openxmlformats.org/markup-compatibility/2006" xmlns:r="http://schemas.openxmlformats.org/officeDocument/2006/relationships" xmlns:w="http://schemas.openxmlformats.org/wordprocessingml/2006/main" xmlns:w14="http://schemas.microsoft.com/office/word/2010/wordml" mc:Ignorable="w14">
   <w:docDefaults>
     <w:rPrDefault>
@@ -3742,7 +3882,7 @@
 </w:styles>
 </file>
 
-<file path=word/stylesWithEffects.xml><?xml version="1.0" encoding="utf-8"?>
+<file path=word\stylesWithEffects.xml><?xml version="1.0" encoding="utf-8"?>
 <w:styles xmlns:wpc="http://schemas.microsoft.com/office/word/2010/wordprocessingCanvas" xmlns:mc="http://schemas.openxmlformats.org/markup-compatibility/2006" xmlns:o="urn:schemas-microsoft-com:office:office" xmlns:r="http://schemas.openxmlformats.org/officeDocument/2006/relationships" xmlns:m="http://schemas.openxmlformats.org/officeDocument/2006/math" xmlns:v="urn:schemas-microsoft-com:vml" xmlns:wp14="http://schemas.microsoft.com/office/word/2010/wordprocessingDrawing" xmlns:wp="http://schemas.openxmlformats.org/drawingml/2006/wordprocessingDrawing" xmlns:w10="urn:schemas-microsoft-com:office:word" xmlns:w="http://schemas.openxmlformats.org/wordprocessingml/2006/main" xmlns:w14="http://schemas.microsoft.com/office/word/2010/wordml" xmlns:wpg="http://schemas.microsoft.com/office/word/2010/wordprocessingGroup" xmlns:wpi="http://schemas.microsoft.com/office/word/2010/wordprocessingInk" xmlns:wne="http://schemas.microsoft.com/office/word/2006/wordml" xmlns:wps="http://schemas.microsoft.com/office/word/2010/wordprocessingShape" mc:Ignorable="w14 wp14">
   <w:docDefaults>
     <w:rPrDefault>
@@ -4176,7 +4316,7 @@
 </w:styles>
 </file>
 
-<file path=word/theme/theme1.xml><?xml version="1.0" encoding="utf-8"?>
+<file path=word\theme\theme1.xml><?xml version="1.0" encoding="utf-8"?>
 <a:theme xmlns:a="http://schemas.openxmlformats.org/drawingml/2006/main" name="Office Theme">
   <a:themeElements>
     <a:clrScheme name="Office">
@@ -4459,4 +4599,448 @@
   <a:objectDefaults/>
   <a:extraClrSchemeLst/>
 </a:theme>
+</file>
+
+<file path=word\webSettings.xml><?xml version="1.0" encoding="utf-8"?>
+<w:webSettings xmlns:mc="http://schemas.openxmlformats.org/markup-compatibility/2006" xmlns:r="http://schemas.openxmlformats.org/officeDocument/2006/relationships" xmlns:w="http://schemas.openxmlformats.org/wordprocessingml/2006/main" xmlns:w14="http://schemas.microsoft.com/office/word/2010/wordml" mc:Ignorable="w14">
+  <w:divs>
+    <w:div w:id="44834474">
+      <w:marLeft w:val="0"/>
+      <w:marRight w:val="0"/>
+      <w:marTop w:val="0"/>
+      <w:marBottom w:val="180"/>
+      <w:divBdr>
+        <w:top w:val="none" w:sz="0" w:space="0" w:color="auto"/>
+        <w:left w:val="none" w:sz="0" w:space="0" w:color="auto"/>
+        <w:bottom w:val="none" w:sz="0" w:space="0" w:color="auto"/>
+        <w:right w:val="none" w:sz="0" w:space="0" w:color="auto"/>
+      </w:divBdr>
+    </w:div>
+    <w:div w:id="50034107">
+      <w:marLeft w:val="0"/>
+      <w:marRight w:val="0"/>
+      <w:marTop w:val="0"/>
+      <w:marBottom w:val="180"/>
+      <w:divBdr>
+        <w:top w:val="none" w:sz="0" w:space="0" w:color="auto"/>
+        <w:left w:val="none" w:sz="0" w:space="0" w:color="auto"/>
+        <w:bottom w:val="none" w:sz="0" w:space="0" w:color="auto"/>
+        <w:right w:val="none" w:sz="0" w:space="0" w:color="auto"/>
+      </w:divBdr>
+    </w:div>
+    <w:div w:id="290399683">
+      <w:marLeft w:val="0"/>
+      <w:marRight w:val="0"/>
+      <w:marTop w:val="0"/>
+      <w:marBottom w:val="180"/>
+      <w:divBdr>
+        <w:top w:val="none" w:sz="0" w:space="0" w:color="auto"/>
+        <w:left w:val="none" w:sz="0" w:space="0" w:color="auto"/>
+        <w:bottom w:val="none" w:sz="0" w:space="0" w:color="auto"/>
+        <w:right w:val="none" w:sz="0" w:space="0" w:color="auto"/>
+      </w:divBdr>
+      <w:divsChild>
+        <w:div w:id="1682969188">
+          <w:marLeft w:val="0"/>
+          <w:marRight w:val="0"/>
+          <w:marTop w:val="0"/>
+          <w:marBottom w:val="120"/>
+          <w:divBdr>
+            <w:top w:val="none" w:sz="0" w:space="0" w:color="auto"/>
+            <w:left w:val="none" w:sz="0" w:space="0" w:color="auto"/>
+            <w:bottom w:val="none" w:sz="0" w:space="0" w:color="auto"/>
+            <w:right w:val="none" w:sz="0" w:space="0" w:color="auto"/>
+          </w:divBdr>
+          <w:divsChild>
+            <w:div w:id="2026251231">
+              <w:marLeft w:val="0"/>
+              <w:marRight w:val="0"/>
+              <w:marTop w:val="0"/>
+              <w:marBottom w:val="0"/>
+              <w:divBdr>
+                <w:top w:val="none" w:sz="0" w:space="0" w:color="auto"/>
+                <w:left w:val="none" w:sz="0" w:space="0" w:color="auto"/>
+                <w:bottom w:val="none" w:sz="0" w:space="0" w:color="auto"/>
+                <w:right w:val="none" w:sz="0" w:space="0" w:color="auto"/>
+              </w:divBdr>
+            </w:div>
+            <w:div w:id="703021644">
+              <w:marLeft w:val="0"/>
+              <w:marRight w:val="0"/>
+              <w:marTop w:val="0"/>
+              <w:marBottom w:val="0"/>
+              <w:divBdr>
+                <w:top w:val="none" w:sz="0" w:space="0" w:color="auto"/>
+                <w:left w:val="none" w:sz="0" w:space="0" w:color="auto"/>
+                <w:bottom w:val="none" w:sz="0" w:space="0" w:color="auto"/>
+                <w:right w:val="none" w:sz="0" w:space="0" w:color="auto"/>
+              </w:divBdr>
+            </w:div>
+            <w:div w:id="2014915565">
+              <w:marLeft w:val="0"/>
+              <w:marRight w:val="0"/>
+              <w:marTop w:val="0"/>
+              <w:marBottom w:val="0"/>
+              <w:divBdr>
+                <w:top w:val="none" w:sz="0" w:space="0" w:color="auto"/>
+                <w:left w:val="none" w:sz="0" w:space="0" w:color="auto"/>
+                <w:bottom w:val="none" w:sz="0" w:space="0" w:color="auto"/>
+                <w:right w:val="none" w:sz="0" w:space="0" w:color="auto"/>
+              </w:divBdr>
+            </w:div>
+            <w:div w:id="1239560778">
+              <w:marLeft w:val="0"/>
+              <w:marRight w:val="0"/>
+              <w:marTop w:val="0"/>
+              <w:marBottom w:val="0"/>
+              <w:divBdr>
+                <w:top w:val="none" w:sz="0" w:space="0" w:color="auto"/>
+                <w:left w:val="none" w:sz="0" w:space="0" w:color="auto"/>
+                <w:bottom w:val="none" w:sz="0" w:space="0" w:color="auto"/>
+                <w:right w:val="none" w:sz="0" w:space="0" w:color="auto"/>
+              </w:divBdr>
+            </w:div>
+            <w:div w:id="1463380628">
+              <w:marLeft w:val="0"/>
+              <w:marRight w:val="0"/>
+              <w:marTop w:val="0"/>
+              <w:marBottom w:val="0"/>
+              <w:divBdr>
+                <w:top w:val="none" w:sz="0" w:space="0" w:color="auto"/>
+                <w:left w:val="none" w:sz="0" w:space="0" w:color="auto"/>
+                <w:bottom w:val="none" w:sz="0" w:space="0" w:color="auto"/>
+                <w:right w:val="none" w:sz="0" w:space="0" w:color="auto"/>
+              </w:divBdr>
+            </w:div>
+            <w:div w:id="1597323300">
+              <w:marLeft w:val="0"/>
+              <w:marRight w:val="0"/>
+              <w:marTop w:val="0"/>
+              <w:marBottom w:val="0"/>
+              <w:divBdr>
+                <w:top w:val="none" w:sz="0" w:space="0" w:color="auto"/>
+                <w:left w:val="none" w:sz="0" w:space="0" w:color="auto"/>
+                <w:bottom w:val="none" w:sz="0" w:space="0" w:color="auto"/>
+                <w:right w:val="none" w:sz="0" w:space="0" w:color="auto"/>
+              </w:divBdr>
+            </w:div>
+            <w:div w:id="1530028921">
+              <w:marLeft w:val="0"/>
+              <w:marRight w:val="0"/>
+              <w:marTop w:val="0"/>
+              <w:marBottom w:val="0"/>
+              <w:divBdr>
+                <w:top w:val="none" w:sz="0" w:space="0" w:color="auto"/>
+                <w:left w:val="none" w:sz="0" w:space="0" w:color="auto"/>
+                <w:bottom w:val="none" w:sz="0" w:space="0" w:color="auto"/>
+                <w:right w:val="none" w:sz="0" w:space="0" w:color="auto"/>
+              </w:divBdr>
+            </w:div>
+            <w:div w:id="737675911">
+              <w:marLeft w:val="0"/>
+              <w:marRight w:val="0"/>
+              <w:marTop w:val="0"/>
+              <w:marBottom w:val="0"/>
+              <w:divBdr>
+                <w:top w:val="none" w:sz="0" w:space="0" w:color="auto"/>
+                <w:left w:val="none" w:sz="0" w:space="0" w:color="auto"/>
+                <w:bottom w:val="none" w:sz="0" w:space="0" w:color="auto"/>
+                <w:right w:val="none" w:sz="0" w:space="0" w:color="auto"/>
+              </w:divBdr>
+            </w:div>
+          </w:divsChild>
+        </w:div>
+      </w:divsChild>
+    </w:div>
+    <w:div w:id="1021323100">
+      <w:marLeft w:val="0"/>
+      <w:marRight w:val="0"/>
+      <w:marTop w:val="0"/>
+      <w:marBottom w:val="240"/>
+      <w:divBdr>
+        <w:top w:val="none" w:sz="0" w:space="0" w:color="auto"/>
+        <w:left w:val="none" w:sz="0" w:space="0" w:color="auto"/>
+        <w:bottom w:val="single" w:sz="12" w:space="9" w:color="0D7377"/>
+        <w:right w:val="none" w:sz="0" w:space="0" w:color="auto"/>
+      </w:divBdr>
+      <w:divsChild>
+        <w:div w:id="693576110">
+          <w:marLeft w:val="0"/>
+          <w:marRight w:val="0"/>
+          <w:marTop w:val="0"/>
+          <w:marBottom w:val="0"/>
+          <w:divBdr>
+            <w:top w:val="none" w:sz="0" w:space="0" w:color="auto"/>
+            <w:left w:val="none" w:sz="0" w:space="0" w:color="auto"/>
+            <w:bottom w:val="none" w:sz="0" w:space="0" w:color="auto"/>
+            <w:right w:val="none" w:sz="0" w:space="0" w:color="auto"/>
+          </w:divBdr>
+        </w:div>
+        <w:div w:id="653947017">
+          <w:marLeft w:val="0"/>
+          <w:marRight w:val="0"/>
+          <w:marTop w:val="60"/>
+          <w:marBottom w:val="0"/>
+          <w:divBdr>
+            <w:top w:val="none" w:sz="0" w:space="0" w:color="auto"/>
+            <w:left w:val="none" w:sz="0" w:space="0" w:color="auto"/>
+            <w:bottom w:val="none" w:sz="0" w:space="0" w:color="auto"/>
+            <w:right w:val="none" w:sz="0" w:space="0" w:color="auto"/>
+          </w:divBdr>
+        </w:div>
+        <w:div w:id="1650088631">
+          <w:marLeft w:val="0"/>
+          <w:marRight w:val="0"/>
+          <w:marTop w:val="90"/>
+          <w:marBottom w:val="0"/>
+          <w:divBdr>
+            <w:top w:val="none" w:sz="0" w:space="0" w:color="auto"/>
+            <w:left w:val="none" w:sz="0" w:space="0" w:color="auto"/>
+            <w:bottom w:val="none" w:sz="0" w:space="0" w:color="auto"/>
+            <w:right w:val="none" w:sz="0" w:space="0" w:color="auto"/>
+          </w:divBdr>
+        </w:div>
+      </w:divsChild>
+    </w:div>
+    <w:div w:id="1068459083">
+      <w:marLeft w:val="0"/>
+      <w:marRight w:val="0"/>
+      <w:marTop w:val="0"/>
+      <w:marBottom w:val="180"/>
+      <w:divBdr>
+        <w:top w:val="none" w:sz="0" w:space="0" w:color="auto"/>
+        <w:left w:val="none" w:sz="0" w:space="0" w:color="auto"/>
+        <w:bottom w:val="none" w:sz="0" w:space="0" w:color="auto"/>
+        <w:right w:val="none" w:sz="0" w:space="0" w:color="auto"/>
+      </w:divBdr>
+    </w:div>
+    <w:div w:id="1449082192">
+      <w:marLeft w:val="0"/>
+      <w:marRight w:val="0"/>
+      <w:marTop w:val="0"/>
+      <w:marBottom w:val="180"/>
+      <w:divBdr>
+        <w:top w:val="none" w:sz="0" w:space="0" w:color="auto"/>
+        <w:left w:val="none" w:sz="0" w:space="0" w:color="auto"/>
+        <w:bottom w:val="none" w:sz="0" w:space="0" w:color="auto"/>
+        <w:right w:val="none" w:sz="0" w:space="0" w:color="auto"/>
+      </w:divBdr>
+      <w:divsChild>
+        <w:div w:id="1792016894">
+          <w:marLeft w:val="0"/>
+          <w:marRight w:val="0"/>
+          <w:marTop w:val="0"/>
+          <w:marBottom w:val="60"/>
+          <w:divBdr>
+            <w:top w:val="none" w:sz="0" w:space="0" w:color="auto"/>
+            <w:left w:val="none" w:sz="0" w:space="0" w:color="auto"/>
+            <w:bottom w:val="none" w:sz="0" w:space="0" w:color="auto"/>
+            <w:right w:val="none" w:sz="0" w:space="0" w:color="auto"/>
+          </w:divBdr>
+        </w:div>
+        <w:div w:id="75593996">
+          <w:marLeft w:val="0"/>
+          <w:marRight w:val="0"/>
+          <w:marTop w:val="0"/>
+          <w:marBottom w:val="60"/>
+          <w:divBdr>
+            <w:top w:val="none" w:sz="0" w:space="0" w:color="auto"/>
+            <w:left w:val="none" w:sz="0" w:space="0" w:color="auto"/>
+            <w:bottom w:val="none" w:sz="0" w:space="0" w:color="auto"/>
+            <w:right w:val="none" w:sz="0" w:space="0" w:color="auto"/>
+          </w:divBdr>
+        </w:div>
+      </w:divsChild>
+    </w:div>
+    <w:div w:id="1872300449">
+      <w:marLeft w:val="0"/>
+      <w:marRight w:val="0"/>
+      <w:marTop w:val="0"/>
+      <w:marBottom w:val="180"/>
+      <w:divBdr>
+        <w:top w:val="none" w:sz="0" w:space="0" w:color="auto"/>
+        <w:left w:val="none" w:sz="0" w:space="0" w:color="auto"/>
+        <w:bottom w:val="none" w:sz="0" w:space="0" w:color="auto"/>
+        <w:right w:val="none" w:sz="0" w:space="0" w:color="auto"/>
+      </w:divBdr>
+      <w:divsChild>
+        <w:div w:id="1312061351">
+          <w:marLeft w:val="0"/>
+          <w:marRight w:val="0"/>
+          <w:marTop w:val="0"/>
+          <w:marBottom w:val="120"/>
+          <w:divBdr>
+            <w:top w:val="none" w:sz="0" w:space="0" w:color="auto"/>
+            <w:left w:val="none" w:sz="0" w:space="0" w:color="auto"/>
+            <w:bottom w:val="none" w:sz="0" w:space="0" w:color="auto"/>
+            <w:right w:val="none" w:sz="0" w:space="0" w:color="auto"/>
+          </w:divBdr>
+          <w:divsChild>
+            <w:div w:id="932788317">
+              <w:marLeft w:val="0"/>
+              <w:marRight w:val="0"/>
+              <w:marTop w:val="0"/>
+              <w:marBottom w:val="0"/>
+              <w:divBdr>
+                <w:top w:val="none" w:sz="0" w:space="0" w:color="auto"/>
+                <w:left w:val="none" w:sz="0" w:space="0" w:color="auto"/>
+                <w:bottom w:val="none" w:sz="0" w:space="0" w:color="auto"/>
+                <w:right w:val="none" w:sz="0" w:space="0" w:color="auto"/>
+              </w:divBdr>
+            </w:div>
+            <w:div w:id="1351564896">
+              <w:marLeft w:val="0"/>
+              <w:marRight w:val="0"/>
+              <w:marTop w:val="0"/>
+              <w:marBottom w:val="0"/>
+              <w:divBdr>
+                <w:top w:val="none" w:sz="0" w:space="0" w:color="auto"/>
+                <w:left w:val="none" w:sz="0" w:space="0" w:color="auto"/>
+                <w:bottom w:val="none" w:sz="0" w:space="0" w:color="auto"/>
+                <w:right w:val="none" w:sz="0" w:space="0" w:color="auto"/>
+              </w:divBdr>
+            </w:div>
+            <w:div w:id="219288858">
+              <w:marLeft w:val="0"/>
+              <w:marRight w:val="0"/>
+              <w:marTop w:val="0"/>
+              <w:marBottom w:val="0"/>
+              <w:divBdr>
+                <w:top w:val="none" w:sz="0" w:space="0" w:color="auto"/>
+                <w:left w:val="none" w:sz="0" w:space="0" w:color="auto"/>
+                <w:bottom w:val="none" w:sz="0" w:space="0" w:color="auto"/>
+                <w:right w:val="none" w:sz="0" w:space="0" w:color="auto"/>
+              </w:divBdr>
+            </w:div>
+            <w:div w:id="259488346">
+              <w:marLeft w:val="0"/>
+              <w:marRight w:val="0"/>
+              <w:marTop w:val="0"/>
+              <w:marBottom w:val="0"/>
+              <w:divBdr>
+                <w:top w:val="none" w:sz="0" w:space="0" w:color="auto"/>
+                <w:left w:val="none" w:sz="0" w:space="0" w:color="auto"/>
+                <w:bottom w:val="none" w:sz="0" w:space="0" w:color="auto"/>
+                <w:right w:val="none" w:sz="0" w:space="0" w:color="auto"/>
+              </w:divBdr>
+            </w:div>
+            <w:div w:id="41253682">
+              <w:marLeft w:val="0"/>
+              <w:marRight w:val="0"/>
+              <w:marTop w:val="0"/>
+              <w:marBottom w:val="0"/>
+              <w:divBdr>
+                <w:top w:val="none" w:sz="0" w:space="0" w:color="auto"/>
+                <w:left w:val="none" w:sz="0" w:space="0" w:color="auto"/>
+                <w:bottom w:val="none" w:sz="0" w:space="0" w:color="auto"/>
+                <w:right w:val="none" w:sz="0" w:space="0" w:color="auto"/>
+              </w:divBdr>
+            </w:div>
+            <w:div w:id="1377924678">
+              <w:marLeft w:val="0"/>
+              <w:marRight w:val="0"/>
+              <w:marTop w:val="0"/>
+              <w:marBottom w:val="0"/>
+              <w:divBdr>
+                <w:top w:val="none" w:sz="0" w:space="0" w:color="auto"/>
+                <w:left w:val="none" w:sz="0" w:space="0" w:color="auto"/>
+                <w:bottom w:val="none" w:sz="0" w:space="0" w:color="auto"/>
+                <w:right w:val="none" w:sz="0" w:space="0" w:color="auto"/>
+              </w:divBdr>
+            </w:div>
+            <w:div w:id="385108490">
+              <w:marLeft w:val="0"/>
+              <w:marRight w:val="0"/>
+              <w:marTop w:val="0"/>
+              <w:marBottom w:val="0"/>
+              <w:divBdr>
+                <w:top w:val="none" w:sz="0" w:space="0" w:color="auto"/>
+                <w:left w:val="none" w:sz="0" w:space="0" w:color="auto"/>
+                <w:bottom w:val="none" w:sz="0" w:space="0" w:color="auto"/>
+                <w:right w:val="none" w:sz="0" w:space="0" w:color="auto"/>
+              </w:divBdr>
+            </w:div>
+            <w:div w:id="158930914">
+              <w:marLeft w:val="0"/>
+              <w:marRight w:val="0"/>
+              <w:marTop w:val="0"/>
+              <w:marBottom w:val="0"/>
+              <w:divBdr>
+                <w:top w:val="none" w:sz="0" w:space="0" w:color="auto"/>
+                <w:left w:val="none" w:sz="0" w:space="0" w:color="auto"/>
+                <w:bottom w:val="none" w:sz="0" w:space="0" w:color="auto"/>
+                <w:right w:val="none" w:sz="0" w:space="0" w:color="auto"/>
+              </w:divBdr>
+            </w:div>
+          </w:divsChild>
+        </w:div>
+      </w:divsChild>
+    </w:div>
+    <w:div w:id="1963070217">
+      <w:marLeft w:val="0"/>
+      <w:marRight w:val="0"/>
+      <w:marTop w:val="0"/>
+      <w:marBottom w:val="180"/>
+      <w:divBdr>
+        <w:top w:val="none" w:sz="0" w:space="0" w:color="auto"/>
+        <w:left w:val="none" w:sz="0" w:space="0" w:color="auto"/>
+        <w:bottom w:val="none" w:sz="0" w:space="0" w:color="auto"/>
+        <w:right w:val="none" w:sz="0" w:space="0" w:color="auto"/>
+      </w:divBdr>
+    </w:div>
+    <w:div w:id="2024091474">
+      <w:marLeft w:val="0"/>
+      <w:marRight w:val="0"/>
+      <w:marTop w:val="0"/>
+      <w:marBottom w:val="180"/>
+      <w:divBdr>
+        <w:top w:val="none" w:sz="0" w:space="0" w:color="auto"/>
+        <w:left w:val="none" w:sz="0" w:space="0" w:color="auto"/>
+        <w:bottom w:val="none" w:sz="0" w:space="0" w:color="auto"/>
+        <w:right w:val="none" w:sz="0" w:space="0" w:color="auto"/>
+      </w:divBdr>
+      <w:divsChild>
+        <w:div w:id="1363744401">
+          <w:marLeft w:val="0"/>
+          <w:marRight w:val="0"/>
+          <w:marTop w:val="0"/>
+          <w:marBottom w:val="60"/>
+          <w:divBdr>
+            <w:top w:val="none" w:sz="0" w:space="0" w:color="auto"/>
+            <w:left w:val="none" w:sz="0" w:space="0" w:color="auto"/>
+            <w:bottom w:val="none" w:sz="0" w:space="0" w:color="auto"/>
+            <w:right w:val="none" w:sz="0" w:space="0" w:color="auto"/>
+          </w:divBdr>
+        </w:div>
+        <w:div w:id="1388727941">
+          <w:marLeft w:val="0"/>
+          <w:marRight w:val="0"/>
+          <w:marTop w:val="0"/>
+          <w:marBottom w:val="60"/>
+          <w:divBdr>
+            <w:top w:val="none" w:sz="0" w:space="0" w:color="auto"/>
+            <w:left w:val="none" w:sz="0" w:space="0" w:color="auto"/>
+            <w:bottom w:val="none" w:sz="0" w:space="0" w:color="auto"/>
+            <w:right w:val="none" w:sz="0" w:space="0" w:color="auto"/>
+          </w:divBdr>
+        </w:div>
+        <w:div w:id="2060519357">
+          <w:marLeft w:val="0"/>
+          <w:marRight w:val="0"/>
+          <w:marTop w:val="0"/>
+          <w:marBottom w:val="60"/>
+          <w:divBdr>
+            <w:top w:val="none" w:sz="0" w:space="0" w:color="auto"/>
+            <w:left w:val="none" w:sz="0" w:space="0" w:color="auto"/>
+            <w:bottom w:val="none" w:sz="0" w:space="0" w:color="auto"/>
+            <w:right w:val="none" w:sz="0" w:space="0" w:color="auto"/>
+          </w:divBdr>
+        </w:div>
+      </w:divsChild>
+    </w:div>
+  </w:divs>
+  <w:encoding w:val="unicode"/>
+  <w:optimizeForBrowser/>
+  <w:allowPNG/>
+</w:webSettings>
 </file>
</xml_diff>